<commit_message>
Algorítmica 1.º Esencial v1.1: correcciones de la auditoría independiente
- Planes de continuación: el Tema coincide con la fila del Plan Anual (campo único).
- Clase 14: diagrama de flujo del algoritmo distinguido del DFD de análisis de sistemas.
- Clase 12: dilema constructivo, sin atribuir la nomenclatura al programa (texto, tabla y Figura 12.1).
- Clases 3, 7, 12 y 17: sin expresiones no verificables.
- Clases 15 a 18: expresiones de código escritas en el texto sin punto de miles.
- Índice verificado: 129 páginas físicas; el corrimiento señalado venía de la portada sin texto.
Auditoría automática: 737 controles, 0 fallos.

Co-Authored-By: Claude Opus 5.5 <noreply@anthropic.com>
Claude-Session: https://claude.ai/code/session_01LqBrALZn8HbnzzUtvCFRMa
</commit_message>
<xml_diff>
--- a/algoritmica_1_esencial/salida/Algoritmica_1er_Curso_PLAN_ANUAL_ESENCIAL_COMERCIAL_2026.docx
+++ b/algoritmica_1_esencial/salida/Algoritmica_1er_Curso_PLAN_ANUAL_ESENCIAL_COMERCIAL_2026.docx
@@ -729,19 +729,7 @@
                 <w:b w:val="0"/>
                 <w:sz w:val="16"/>
               </w:rPr>
-              <w:t>Continuación de la Clase 2 · Práctica 2</w:t>
-            </w:r>
-          </w:p>
-          <w:p>
-            <w:pPr>
-              <w:spacing w:after="20"/>
-            </w:pPr>
-            <w:r>
-              <w:rPr>
-                <w:b w:val="0"/>
-                <w:sz w:val="16"/>
-              </w:rPr>
-              <w:t>Clasificar conjuntos y generar subconjuntos.</w:t>
+              <w:t>Continuación de la Clase 2 · Práctica 2: Clasificar conjuntos y generar subconjuntos.</w:t>
             </w:r>
           </w:p>
         </w:tc>
@@ -1212,19 +1200,7 @@
                 <w:b w:val="0"/>
                 <w:sz w:val="16"/>
               </w:rPr>
-              <w:t>Continuación de la Clase 4 · Práctica 4</w:t>
-            </w:r>
-          </w:p>
-          <w:p>
-            <w:pPr>
-              <w:spacing w:after="20"/>
-            </w:pPr>
-            <w:r>
-              <w:rPr>
-                <w:b w:val="0"/>
-                <w:sz w:val="16"/>
-              </w:rPr>
-              <w:t>Unir e intersecar conjuntos.</w:t>
+              <w:t>Continuación de la Clase 4 · Práctica 4: Unir e intersecar conjuntos.</w:t>
             </w:r>
           </w:p>
         </w:tc>
@@ -1534,19 +1510,7 @@
                 <w:b w:val="0"/>
                 <w:sz w:val="16"/>
               </w:rPr>
-              <w:t>Continuación de la Clase 5 · Práctica 5</w:t>
-            </w:r>
-          </w:p>
-          <w:p>
-            <w:pPr>
-              <w:spacing w:after="20"/>
-            </w:pPr>
-            <w:r>
-              <w:rPr>
-                <w:b w:val="0"/>
-                <w:sz w:val="16"/>
-              </w:rPr>
-              <w:t>Diferencia, complemento y problemas de conteo.</w:t>
+              <w:t>Continuación de la Clase 5 · Práctica 5: Diferencia, complemento y problemas de conteo.</w:t>
             </w:r>
           </w:p>
         </w:tc>
@@ -2042,19 +2006,7 @@
                 <w:b w:val="0"/>
                 <w:sz w:val="16"/>
               </w:rPr>
-              <w:t>Continuación de la Clase 7 · Práctica 7</w:t>
-            </w:r>
-          </w:p>
-          <w:p>
-            <w:pPr>
-              <w:spacing w:after="20"/>
-            </w:pPr>
-            <w:r>
-              <w:rPr>
-                <w:b w:val="0"/>
-                <w:sz w:val="16"/>
-              </w:rPr>
-              <w:t>Simbolizar y evaluar con conectivos.</w:t>
+              <w:t>Continuación de la Clase 7 · Práctica 7: Simbolizar y evaluar con conectivos.</w:t>
             </w:r>
           </w:p>
         </w:tc>
@@ -2364,19 +2316,7 @@
                 <w:b w:val="0"/>
                 <w:sz w:val="16"/>
               </w:rPr>
-              <w:t>Continuación de la Clase 8 · Práctica 8</w:t>
-            </w:r>
-          </w:p>
-          <w:p>
-            <w:pPr>
-              <w:spacing w:after="20"/>
-            </w:pPr>
-            <w:r>
-              <w:rPr>
-                <w:b w:val="0"/>
-                <w:sz w:val="16"/>
-              </w:rPr>
-              <w:t>Construir tablas de verdad (dos variables).</w:t>
+              <w:t>Continuación de la Clase 8 · Práctica 8: Construir tablas de verdad (dos variables).</w:t>
             </w:r>
           </w:p>
         </w:tc>
@@ -2686,19 +2626,7 @@
                 <w:b w:val="0"/>
                 <w:sz w:val="16"/>
               </w:rPr>
-              <w:t>Continuación de la Clase 9 · Práctica 9</w:t>
-            </w:r>
-          </w:p>
-          <w:p>
-            <w:pPr>
-              <w:spacing w:after="20"/>
-            </w:pPr>
-            <w:r>
-              <w:rPr>
-                <w:b w:val="0"/>
-                <w:sz w:val="16"/>
-              </w:rPr>
-              <w:t>Tres variables y clasificación de fórmulas.</w:t>
+              <w:t>Continuación de la Clase 9 · Práctica 9: Tres variables y clasificación de fórmulas.</w:t>
             </w:r>
           </w:p>
         </w:tc>
@@ -3330,19 +3258,7 @@
                 <w:b w:val="0"/>
                 <w:sz w:val="16"/>
               </w:rPr>
-              <w:t>Continuación de la Clase 12 · Práctica 12</w:t>
-            </w:r>
-          </w:p>
-          <w:p>
-            <w:pPr>
-              <w:spacing w:after="20"/>
-            </w:pPr>
-            <w:r>
-              <w:rPr>
-                <w:b w:val="0"/>
-                <w:sz w:val="16"/>
-              </w:rPr>
-              <w:t>Deducir con reglas de inferencia.</w:t>
+              <w:t>Continuación de la Clase 12 · Práctica 12: Deducir con reglas de inferencia.</w:t>
             </w:r>
           </w:p>
         </w:tc>
@@ -4018,19 +3934,7 @@
                 <w:b w:val="0"/>
                 <w:sz w:val="16"/>
               </w:rPr>
-              <w:t>Continuación de la Clase 14 · Práctica 14</w:t>
-            </w:r>
-          </w:p>
-          <w:p>
-            <w:pPr>
-              <w:spacing w:after="20"/>
-            </w:pPr>
-            <w:r>
-              <w:rPr>
-                <w:b w:val="0"/>
-                <w:sz w:val="16"/>
-              </w:rPr>
-              <w:t>Escribir pseudocódigo y dibujar diagramas.</w:t>
+              <w:t>Continuación de la Clase 14 · Práctica 14: Escribir pseudocódigo y dibujar diagramas.</w:t>
             </w:r>
           </w:p>
         </w:tc>
@@ -4501,19 +4405,7 @@
                 <w:b w:val="0"/>
                 <w:sz w:val="16"/>
               </w:rPr>
-              <w:t>Continuación de la Clase 16 · Práctica 16</w:t>
-            </w:r>
-          </w:p>
-          <w:p>
-            <w:pPr>
-              <w:spacing w:after="20"/>
-            </w:pPr>
-            <w:r>
-              <w:rPr>
-                <w:b w:val="0"/>
-                <w:sz w:val="16"/>
-              </w:rPr>
-              <w:t>Algoritmos secuenciales y prueba de escritorio.</w:t>
+              <w:t>Continuación de la Clase 16 · Práctica 16: Algoritmos secuenciales y prueba de escritorio.</w:t>
             </w:r>
           </w:p>
         </w:tc>
@@ -4823,19 +4715,7 @@
                 <w:b w:val="0"/>
                 <w:sz w:val="16"/>
               </w:rPr>
-              <w:t>Continuación de la Clase 17 · Práctica 17</w:t>
-            </w:r>
-          </w:p>
-          <w:p>
-            <w:pPr>
-              <w:spacing w:after="20"/>
-            </w:pPr>
-            <w:r>
-              <w:rPr>
-                <w:b w:val="0"/>
-                <w:sz w:val="16"/>
-              </w:rPr>
-              <w:t>Decidir con Si–Entonces–Sino.</w:t>
+              <w:t>Continuación de la Clase 17 · Práctica 17: Decidir con Si–Entonces–Sino.</w:t>
             </w:r>
           </w:p>
         </w:tc>
@@ -5145,19 +5025,7 @@
                 <w:b w:val="0"/>
                 <w:sz w:val="16"/>
               </w:rPr>
-              <w:t>Continuación de la Clase 18 · Práctica 18</w:t>
-            </w:r>
-          </w:p>
-          <w:p>
-            <w:pPr>
-              <w:spacing w:after="20"/>
-            </w:pPr>
-            <w:r>
-              <w:rPr>
-                <w:b w:val="0"/>
-                <w:sz w:val="16"/>
-              </w:rPr>
-              <w:t>Clasificar con decisiones anidadas.</w:t>
+              <w:t>Continuación de la Clase 18 · Práctica 18: Clasificar con decisiones anidadas.</w:t>
             </w:r>
           </w:p>
         </w:tc>
@@ -5467,19 +5335,7 @@
                 <w:b w:val="0"/>
                 <w:sz w:val="16"/>
               </w:rPr>
-              <w:t>Continuación de la Clase 19 · Práctica 19</w:t>
-            </w:r>
-          </w:p>
-          <w:p>
-            <w:pPr>
-              <w:spacing w:after="20"/>
-            </w:pPr>
-            <w:r>
-              <w:rPr>
-                <w:b w:val="0"/>
-                <w:sz w:val="16"/>
-              </w:rPr>
-              <w:t>Repetir con ciclos y contadores.</w:t>
+              <w:t>Continuación de la Clase 19 · Práctica 19: Repetir con ciclos y contadores.</w:t>
             </w:r>
           </w:p>
         </w:tc>
@@ -5789,19 +5645,7 @@
                 <w:b w:val="0"/>
                 <w:sz w:val="16"/>
               </w:rPr>
-              <w:t>Continuación de la Clase 20 · Práctica 20</w:t>
-            </w:r>
-          </w:p>
-          <w:p>
-            <w:pPr>
-              <w:spacing w:after="20"/>
-            </w:pPr>
-            <w:r>
-              <w:rPr>
-                <w:b w:val="0"/>
-                <w:sz w:val="16"/>
-              </w:rPr>
-              <w:t>Acumular totales y promedios.</w:t>
+              <w:t>Continuación de la Clase 20 · Práctica 20: Acumular totales y promedios.</w:t>
             </w:r>
           </w:p>
         </w:tc>
@@ -6111,19 +5955,7 @@
                 <w:b w:val="0"/>
                 <w:sz w:val="16"/>
               </w:rPr>
-              <w:t>Continuación de la Clase 21 · Práctica 21</w:t>
-            </w:r>
-          </w:p>
-          <w:p>
-            <w:pPr>
-              <w:spacing w:after="20"/>
-            </w:pPr>
-            <w:r>
-              <w:rPr>
-                <w:b w:val="0"/>
-                <w:sz w:val="16"/>
-              </w:rPr>
-              <w:t>Proyecto: construir el sistema de caja completo.</w:t>
+              <w:t>Continuación de la Clase 21 · Práctica 21: Proyecto: construir el sistema de caja completo.</w:t>
             </w:r>
           </w:p>
         </w:tc>

</xml_diff>

<commit_message>
Algorítmica 1.º Esencial v1.2: formato oficio en todo el paquete
Oficio 21,6 × 33 cm (Plan Anual en horizontal), márgenes estrechos de 1,27 cm y tablas
al 100 % del ancho útil, por costo de impresión. Portadas regeneradas en proporción oficio.
Libro 108 págs., solucionario 19, Plan Anual 8, Planes de Clase 43, muestra 14.
Auditoría automática: 753 controles (16 nuevos de formato), 0 fallos.

Co-Authored-By: Claude Opus 5.5 <noreply@anthropic.com>
Claude-Session: https://claude.ai/code/session_01LqBrALZn8HbnzzUtvCFRMa
</commit_message>
<xml_diff>
--- a/algoritmica_1_esencial/salida/Algoritmica_1er_Curso_PLAN_ANUAL_ESENCIAL_COMERCIAL_2026.docx
+++ b/algoritmica_1_esencial/salida/Algoritmica_1er_Curso_PLAN_ANUAL_ESENCIAL_COMERCIAL_2026.docx
@@ -16,7 +16,7 @@
             <wp:positionV relativeFrom="page">
               <wp:posOffset>0</wp:posOffset>
             </wp:positionV>
-            <wp:extent cx="7560000" cy="10692000"/>
+            <wp:extent cx="7776000" cy="11880000"/>
             <wp:effectExtent l="0" t="0" r="0" b="0"/>
             <wp:wrapNone/>
             <wp:docPr id="1" name="Portada" descr="Portada"/>
@@ -37,7 +37,7 @@
                   <pic:spPr>
                     <a:xfrm>
                       <a:off x="0" y="0"/>
-                      <a:ext cx="7560000" cy="10692000"/>
+                      <a:ext cx="7776000" cy="11880000"/>
                     </a:xfrm>
                     <a:prstGeom prst="rect"/>
                   </pic:spPr>
@@ -52,8 +52,8 @@
       <w:pPr>
         <w:sectPr>
           <w:footerReference w:type="default" r:id="rId36"/>
-          <w:pgSz w:w="11906" w:h="16838"/>
-          <w:pgMar w:top="1134" w:right="1247" w:bottom="1134" w:left="1247" w:header="720" w:footer="720" w:gutter="0"/>
+          <w:pgSz w:w="12246" w:h="18709"/>
+          <w:pgMar w:top="720" w:right="720" w:bottom="720" w:left="720" w:header="340" w:footer="340" w:gutter="0"/>
           <w:cols w:space="720"/>
           <w:docGrid w:linePitch="360"/>
         </w:sectPr>
@@ -172,16 +172,16 @@
           <w:right w:w="70" w:type="dxa"/>
         </w:tblCellMar>
         <w:tblLayout w:type="fixed"/>
-        <w:tblW w:w="15082" w:type="dxa"/>
+        <w:tblW w:w="5000" w:type="pct"/>
       </w:tblPr>
       <w:tblGrid>
-        <w:gridCol w:w="567"/>
-        <w:gridCol w:w="2835"/>
-        <w:gridCol w:w="3855"/>
-        <w:gridCol w:w="850"/>
-        <w:gridCol w:w="3005"/>
-        <w:gridCol w:w="2381"/>
-        <w:gridCol w:w="1587"/>
+        <w:gridCol w:w="649"/>
+        <w:gridCol w:w="3246"/>
+        <w:gridCol w:w="4415"/>
+        <w:gridCol w:w="973"/>
+        <w:gridCol w:w="3441"/>
+        <w:gridCol w:w="2726"/>
+        <w:gridCol w:w="1817"/>
       </w:tblGrid>
       <w:tr>
         <w:trPr>
@@ -190,7 +190,7 @@
         </w:trPr>
         <w:tc>
           <w:tcPr>
-            <w:tcW w:type="dxa" w:w="567"/>
+            <w:tcW w:type="dxa" w:w="649"/>
             <w:shd w:val="clear" w:color="auto" w:fill="1B5E20"/>
           </w:tcPr>
           <w:p>
@@ -209,7 +209,7 @@
         </w:tc>
         <w:tc>
           <w:tcPr>
-            <w:tcW w:type="dxa" w:w="2835"/>
+            <w:tcW w:type="dxa" w:w="3246"/>
             <w:shd w:val="clear" w:color="auto" w:fill="1B5E20"/>
           </w:tcPr>
           <w:p>
@@ -228,7 +228,7 @@
         </w:tc>
         <w:tc>
           <w:tcPr>
-            <w:tcW w:type="dxa" w:w="3855"/>
+            <w:tcW w:type="dxa" w:w="4415"/>
             <w:shd w:val="clear" w:color="auto" w:fill="1B5E20"/>
           </w:tcPr>
           <w:p>
@@ -247,7 +247,7 @@
         </w:tc>
         <w:tc>
           <w:tcPr>
-            <w:tcW w:type="dxa" w:w="850"/>
+            <w:tcW w:type="dxa" w:w="974"/>
             <w:shd w:val="clear" w:color="auto" w:fill="1B5E20"/>
           </w:tcPr>
           <w:p>
@@ -266,7 +266,7 @@
         </w:tc>
         <w:tc>
           <w:tcPr>
-            <w:tcW w:type="dxa" w:w="3005"/>
+            <w:tcW w:type="dxa" w:w="3441"/>
             <w:shd w:val="clear" w:color="auto" w:fill="1B5E20"/>
           </w:tcPr>
           <w:p>
@@ -285,7 +285,7 @@
         </w:tc>
         <w:tc>
           <w:tcPr>
-            <w:tcW w:type="dxa" w:w="2381"/>
+            <w:tcW w:type="dxa" w:w="2727"/>
             <w:shd w:val="clear" w:color="auto" w:fill="1B5E20"/>
           </w:tcPr>
           <w:p>
@@ -304,7 +304,7 @@
         </w:tc>
         <w:tc>
           <w:tcPr>
-            <w:tcW w:type="dxa" w:w="1587"/>
+            <w:tcW w:type="dxa" w:w="1818"/>
             <w:shd w:val="clear" w:color="auto" w:fill="1B5E20"/>
           </w:tcPr>
           <w:p>
@@ -328,7 +328,7 @@
         </w:trPr>
         <w:tc>
           <w:tcPr>
-            <w:tcW w:type="dxa" w:w="15080"/>
+            <w:tcW w:type="dxa" w:w="17270"/>
             <w:gridSpan w:val="7"/>
             <w:shd w:val="clear" w:color="auto" w:fill="1B4F72"/>
           </w:tcPr>
@@ -353,7 +353,7 @@
         </w:trPr>
         <w:tc>
           <w:tcPr>
-            <w:tcW w:type="dxa" w:w="15080"/>
+            <w:tcW w:type="dxa" w:w="17270"/>
             <w:gridSpan w:val="7"/>
             <w:shd w:val="clear" w:color="auto" w:fill="2E7D32"/>
           </w:tcPr>
@@ -378,7 +378,7 @@
         </w:trPr>
         <w:tc>
           <w:tcPr>
-            <w:tcW w:type="dxa" w:w="567"/>
+            <w:tcW w:type="dxa" w:w="649"/>
             <w:shd w:val="clear" w:color="auto" w:fill="E8F5E9"/>
           </w:tcPr>
           <w:p>
@@ -396,7 +396,7 @@
         </w:tc>
         <w:tc>
           <w:tcPr>
-            <w:tcW w:type="dxa" w:w="2835"/>
+            <w:tcW w:type="dxa" w:w="3246"/>
           </w:tcPr>
           <w:p>
             <w:pPr>
@@ -425,7 +425,7 @@
         </w:tc>
         <w:tc>
           <w:tcPr>
-            <w:tcW w:type="dxa" w:w="3855"/>
+            <w:tcW w:type="dxa" w:w="4415"/>
           </w:tcPr>
           <w:p>
             <w:pPr>
@@ -466,7 +466,7 @@
         </w:tc>
         <w:tc>
           <w:tcPr>
-            <w:tcW w:type="dxa" w:w="850"/>
+            <w:tcW w:type="dxa" w:w="974"/>
           </w:tcPr>
           <w:p>
             <w:pPr>
@@ -483,7 +483,7 @@
         </w:tc>
         <w:tc>
           <w:tcPr>
-            <w:tcW w:type="dxa" w:w="3005"/>
+            <w:tcW w:type="dxa" w:w="3441"/>
           </w:tcPr>
           <w:p>
             <w:pPr>
@@ -500,7 +500,7 @@
         </w:tc>
         <w:tc>
           <w:tcPr>
-            <w:tcW w:type="dxa" w:w="2381"/>
+            <w:tcW w:type="dxa" w:w="2727"/>
           </w:tcPr>
           <w:p>
             <w:pPr>
@@ -517,7 +517,7 @@
         </w:tc>
         <w:tc>
           <w:tcPr>
-            <w:tcW w:type="dxa" w:w="1587"/>
+            <w:tcW w:type="dxa" w:w="1818"/>
           </w:tcPr>
           <w:p>
             <w:pPr>
@@ -539,7 +539,7 @@
         </w:trPr>
         <w:tc>
           <w:tcPr>
-            <w:tcW w:type="dxa" w:w="567"/>
+            <w:tcW w:type="dxa" w:w="649"/>
             <w:shd w:val="clear" w:color="auto" w:fill="E8F5E9"/>
           </w:tcPr>
           <w:p>
@@ -557,7 +557,7 @@
         </w:tc>
         <w:tc>
           <w:tcPr>
-            <w:tcW w:type="dxa" w:w="2835"/>
+            <w:tcW w:type="dxa" w:w="3246"/>
           </w:tcPr>
           <w:p>
             <w:pPr>
@@ -586,7 +586,7 @@
         </w:tc>
         <w:tc>
           <w:tcPr>
-            <w:tcW w:type="dxa" w:w="3855"/>
+            <w:tcW w:type="dxa" w:w="4415"/>
           </w:tcPr>
           <w:p>
             <w:pPr>
@@ -627,7 +627,7 @@
         </w:tc>
         <w:tc>
           <w:tcPr>
-            <w:tcW w:type="dxa" w:w="850"/>
+            <w:tcW w:type="dxa" w:w="974"/>
           </w:tcPr>
           <w:p>
             <w:pPr>
@@ -644,7 +644,7 @@
         </w:tc>
         <w:tc>
           <w:tcPr>
-            <w:tcW w:type="dxa" w:w="3005"/>
+            <w:tcW w:type="dxa" w:w="3441"/>
           </w:tcPr>
           <w:p>
             <w:pPr>
@@ -661,7 +661,7 @@
         </w:tc>
         <w:tc>
           <w:tcPr>
-            <w:tcW w:type="dxa" w:w="2381"/>
+            <w:tcW w:type="dxa" w:w="2727"/>
           </w:tcPr>
           <w:p>
             <w:pPr>
@@ -678,7 +678,7 @@
         </w:tc>
         <w:tc>
           <w:tcPr>
-            <w:tcW w:type="dxa" w:w="1587"/>
+            <w:tcW w:type="dxa" w:w="1818"/>
           </w:tcPr>
           <w:p>
             <w:pPr>
@@ -700,7 +700,7 @@
         </w:trPr>
         <w:tc>
           <w:tcPr>
-            <w:tcW w:type="dxa" w:w="567"/>
+            <w:tcW w:type="dxa" w:w="649"/>
             <w:shd w:val="clear" w:color="auto" w:fill="E8F5E9"/>
           </w:tcPr>
           <w:p>
@@ -718,7 +718,7 @@
         </w:tc>
         <w:tc>
           <w:tcPr>
-            <w:tcW w:type="dxa" w:w="2835"/>
+            <w:tcW w:type="dxa" w:w="3246"/>
           </w:tcPr>
           <w:p>
             <w:pPr>
@@ -735,7 +735,7 @@
         </w:tc>
         <w:tc>
           <w:tcPr>
-            <w:tcW w:type="dxa" w:w="3855"/>
+            <w:tcW w:type="dxa" w:w="4415"/>
           </w:tcPr>
           <w:p>
             <w:pPr>
@@ -776,7 +776,7 @@
         </w:tc>
         <w:tc>
           <w:tcPr>
-            <w:tcW w:type="dxa" w:w="850"/>
+            <w:tcW w:type="dxa" w:w="974"/>
           </w:tcPr>
           <w:p>
             <w:pPr>
@@ -793,7 +793,7 @@
         </w:tc>
         <w:tc>
           <w:tcPr>
-            <w:tcW w:type="dxa" w:w="3005"/>
+            <w:tcW w:type="dxa" w:w="3441"/>
           </w:tcPr>
           <w:p>
             <w:pPr>
@@ -810,7 +810,7 @@
         </w:tc>
         <w:tc>
           <w:tcPr>
-            <w:tcW w:type="dxa" w:w="2381"/>
+            <w:tcW w:type="dxa" w:w="2727"/>
           </w:tcPr>
           <w:p>
             <w:pPr>
@@ -827,7 +827,7 @@
         </w:tc>
         <w:tc>
           <w:tcPr>
-            <w:tcW w:type="dxa" w:w="1587"/>
+            <w:tcW w:type="dxa" w:w="1818"/>
           </w:tcPr>
           <w:p>
             <w:pPr>
@@ -849,7 +849,7 @@
         </w:trPr>
         <w:tc>
           <w:tcPr>
-            <w:tcW w:type="dxa" w:w="567"/>
+            <w:tcW w:type="dxa" w:w="649"/>
             <w:shd w:val="clear" w:color="auto" w:fill="E8F5E9"/>
           </w:tcPr>
           <w:p>
@@ -867,7 +867,7 @@
         </w:tc>
         <w:tc>
           <w:tcPr>
-            <w:tcW w:type="dxa" w:w="2835"/>
+            <w:tcW w:type="dxa" w:w="3246"/>
           </w:tcPr>
           <w:p>
             <w:pPr>
@@ -896,7 +896,7 @@
         </w:tc>
         <w:tc>
           <w:tcPr>
-            <w:tcW w:type="dxa" w:w="3855"/>
+            <w:tcW w:type="dxa" w:w="4415"/>
           </w:tcPr>
           <w:p>
             <w:pPr>
@@ -937,7 +937,7 @@
         </w:tc>
         <w:tc>
           <w:tcPr>
-            <w:tcW w:type="dxa" w:w="850"/>
+            <w:tcW w:type="dxa" w:w="974"/>
           </w:tcPr>
           <w:p>
             <w:pPr>
@@ -954,7 +954,7 @@
         </w:tc>
         <w:tc>
           <w:tcPr>
-            <w:tcW w:type="dxa" w:w="3005"/>
+            <w:tcW w:type="dxa" w:w="3441"/>
           </w:tcPr>
           <w:p>
             <w:pPr>
@@ -971,7 +971,7 @@
         </w:tc>
         <w:tc>
           <w:tcPr>
-            <w:tcW w:type="dxa" w:w="2381"/>
+            <w:tcW w:type="dxa" w:w="2727"/>
           </w:tcPr>
           <w:p>
             <w:pPr>
@@ -988,7 +988,7 @@
         </w:tc>
         <w:tc>
           <w:tcPr>
-            <w:tcW w:type="dxa" w:w="1587"/>
+            <w:tcW w:type="dxa" w:w="1818"/>
           </w:tcPr>
           <w:p>
             <w:pPr>
@@ -1010,7 +1010,7 @@
         </w:trPr>
         <w:tc>
           <w:tcPr>
-            <w:tcW w:type="dxa" w:w="567"/>
+            <w:tcW w:type="dxa" w:w="649"/>
             <w:shd w:val="clear" w:color="auto" w:fill="E8F5E9"/>
           </w:tcPr>
           <w:p>
@@ -1028,7 +1028,7 @@
         </w:tc>
         <w:tc>
           <w:tcPr>
-            <w:tcW w:type="dxa" w:w="2835"/>
+            <w:tcW w:type="dxa" w:w="3246"/>
           </w:tcPr>
           <w:p>
             <w:pPr>
@@ -1057,7 +1057,7 @@
         </w:tc>
         <w:tc>
           <w:tcPr>
-            <w:tcW w:type="dxa" w:w="3855"/>
+            <w:tcW w:type="dxa" w:w="4415"/>
           </w:tcPr>
           <w:p>
             <w:pPr>
@@ -1098,7 +1098,7 @@
         </w:tc>
         <w:tc>
           <w:tcPr>
-            <w:tcW w:type="dxa" w:w="850"/>
+            <w:tcW w:type="dxa" w:w="974"/>
           </w:tcPr>
           <w:p>
             <w:pPr>
@@ -1115,7 +1115,7 @@
         </w:tc>
         <w:tc>
           <w:tcPr>
-            <w:tcW w:type="dxa" w:w="3005"/>
+            <w:tcW w:type="dxa" w:w="3441"/>
           </w:tcPr>
           <w:p>
             <w:pPr>
@@ -1132,7 +1132,7 @@
         </w:tc>
         <w:tc>
           <w:tcPr>
-            <w:tcW w:type="dxa" w:w="2381"/>
+            <w:tcW w:type="dxa" w:w="2727"/>
           </w:tcPr>
           <w:p>
             <w:pPr>
@@ -1149,7 +1149,7 @@
         </w:tc>
         <w:tc>
           <w:tcPr>
-            <w:tcW w:type="dxa" w:w="1587"/>
+            <w:tcW w:type="dxa" w:w="1818"/>
           </w:tcPr>
           <w:p>
             <w:pPr>
@@ -1171,7 +1171,7 @@
         </w:trPr>
         <w:tc>
           <w:tcPr>
-            <w:tcW w:type="dxa" w:w="567"/>
+            <w:tcW w:type="dxa" w:w="649"/>
             <w:shd w:val="clear" w:color="auto" w:fill="E8F5E9"/>
           </w:tcPr>
           <w:p>
@@ -1189,7 +1189,7 @@
         </w:tc>
         <w:tc>
           <w:tcPr>
-            <w:tcW w:type="dxa" w:w="2835"/>
+            <w:tcW w:type="dxa" w:w="3246"/>
           </w:tcPr>
           <w:p>
             <w:pPr>
@@ -1206,7 +1206,7 @@
         </w:tc>
         <w:tc>
           <w:tcPr>
-            <w:tcW w:type="dxa" w:w="3855"/>
+            <w:tcW w:type="dxa" w:w="4415"/>
           </w:tcPr>
           <w:p>
             <w:pPr>
@@ -1247,7 +1247,7 @@
         </w:tc>
         <w:tc>
           <w:tcPr>
-            <w:tcW w:type="dxa" w:w="850"/>
+            <w:tcW w:type="dxa" w:w="974"/>
           </w:tcPr>
           <w:p>
             <w:pPr>
@@ -1264,7 +1264,7 @@
         </w:tc>
         <w:tc>
           <w:tcPr>
-            <w:tcW w:type="dxa" w:w="3005"/>
+            <w:tcW w:type="dxa" w:w="3441"/>
           </w:tcPr>
           <w:p>
             <w:pPr>
@@ -1281,7 +1281,7 @@
         </w:tc>
         <w:tc>
           <w:tcPr>
-            <w:tcW w:type="dxa" w:w="2381"/>
+            <w:tcW w:type="dxa" w:w="2727"/>
           </w:tcPr>
           <w:p>
             <w:pPr>
@@ -1298,7 +1298,7 @@
         </w:tc>
         <w:tc>
           <w:tcPr>
-            <w:tcW w:type="dxa" w:w="1587"/>
+            <w:tcW w:type="dxa" w:w="1818"/>
           </w:tcPr>
           <w:p>
             <w:pPr>
@@ -1320,7 +1320,7 @@
         </w:trPr>
         <w:tc>
           <w:tcPr>
-            <w:tcW w:type="dxa" w:w="567"/>
+            <w:tcW w:type="dxa" w:w="649"/>
             <w:shd w:val="clear" w:color="auto" w:fill="E8F5E9"/>
           </w:tcPr>
           <w:p>
@@ -1338,7 +1338,7 @@
         </w:tc>
         <w:tc>
           <w:tcPr>
-            <w:tcW w:type="dxa" w:w="2835"/>
+            <w:tcW w:type="dxa" w:w="3246"/>
           </w:tcPr>
           <w:p>
             <w:pPr>
@@ -1367,7 +1367,7 @@
         </w:tc>
         <w:tc>
           <w:tcPr>
-            <w:tcW w:type="dxa" w:w="3855"/>
+            <w:tcW w:type="dxa" w:w="4415"/>
           </w:tcPr>
           <w:p>
             <w:pPr>
@@ -1408,7 +1408,7 @@
         </w:tc>
         <w:tc>
           <w:tcPr>
-            <w:tcW w:type="dxa" w:w="850"/>
+            <w:tcW w:type="dxa" w:w="974"/>
           </w:tcPr>
           <w:p>
             <w:pPr>
@@ -1425,7 +1425,7 @@
         </w:tc>
         <w:tc>
           <w:tcPr>
-            <w:tcW w:type="dxa" w:w="3005"/>
+            <w:tcW w:type="dxa" w:w="3441"/>
           </w:tcPr>
           <w:p>
             <w:pPr>
@@ -1442,7 +1442,7 @@
         </w:tc>
         <w:tc>
           <w:tcPr>
-            <w:tcW w:type="dxa" w:w="2381"/>
+            <w:tcW w:type="dxa" w:w="2727"/>
           </w:tcPr>
           <w:p>
             <w:pPr>
@@ -1459,7 +1459,7 @@
         </w:tc>
         <w:tc>
           <w:tcPr>
-            <w:tcW w:type="dxa" w:w="1587"/>
+            <w:tcW w:type="dxa" w:w="1818"/>
           </w:tcPr>
           <w:p>
             <w:pPr>
@@ -1481,7 +1481,7 @@
         </w:trPr>
         <w:tc>
           <w:tcPr>
-            <w:tcW w:type="dxa" w:w="567"/>
+            <w:tcW w:type="dxa" w:w="649"/>
             <w:shd w:val="clear" w:color="auto" w:fill="E8F5E9"/>
           </w:tcPr>
           <w:p>
@@ -1499,7 +1499,7 @@
         </w:tc>
         <w:tc>
           <w:tcPr>
-            <w:tcW w:type="dxa" w:w="2835"/>
+            <w:tcW w:type="dxa" w:w="3246"/>
           </w:tcPr>
           <w:p>
             <w:pPr>
@@ -1516,7 +1516,7 @@
         </w:tc>
         <w:tc>
           <w:tcPr>
-            <w:tcW w:type="dxa" w:w="3855"/>
+            <w:tcW w:type="dxa" w:w="4415"/>
           </w:tcPr>
           <w:p>
             <w:pPr>
@@ -1557,7 +1557,7 @@
         </w:tc>
         <w:tc>
           <w:tcPr>
-            <w:tcW w:type="dxa" w:w="850"/>
+            <w:tcW w:type="dxa" w:w="974"/>
           </w:tcPr>
           <w:p>
             <w:pPr>
@@ -1574,7 +1574,7 @@
         </w:tc>
         <w:tc>
           <w:tcPr>
-            <w:tcW w:type="dxa" w:w="3005"/>
+            <w:tcW w:type="dxa" w:w="3441"/>
           </w:tcPr>
           <w:p>
             <w:pPr>
@@ -1591,7 +1591,7 @@
         </w:tc>
         <w:tc>
           <w:tcPr>
-            <w:tcW w:type="dxa" w:w="2381"/>
+            <w:tcW w:type="dxa" w:w="2727"/>
           </w:tcPr>
           <w:p>
             <w:pPr>
@@ -1608,7 +1608,7 @@
         </w:tc>
         <w:tc>
           <w:tcPr>
-            <w:tcW w:type="dxa" w:w="1587"/>
+            <w:tcW w:type="dxa" w:w="1818"/>
           </w:tcPr>
           <w:p>
             <w:pPr>
@@ -1630,7 +1630,7 @@
         </w:trPr>
         <w:tc>
           <w:tcPr>
-            <w:tcW w:type="dxa" w:w="15080"/>
+            <w:tcW w:type="dxa" w:w="17270"/>
             <w:gridSpan w:val="7"/>
             <w:shd w:val="clear" w:color="auto" w:fill="2E7D32"/>
           </w:tcPr>
@@ -1655,7 +1655,7 @@
         </w:trPr>
         <w:tc>
           <w:tcPr>
-            <w:tcW w:type="dxa" w:w="567"/>
+            <w:tcW w:type="dxa" w:w="649"/>
             <w:shd w:val="clear" w:color="auto" w:fill="E8F5E9"/>
           </w:tcPr>
           <w:p>
@@ -1673,7 +1673,7 @@
         </w:tc>
         <w:tc>
           <w:tcPr>
-            <w:tcW w:type="dxa" w:w="2835"/>
+            <w:tcW w:type="dxa" w:w="3246"/>
           </w:tcPr>
           <w:p>
             <w:pPr>
@@ -1702,7 +1702,7 @@
         </w:tc>
         <w:tc>
           <w:tcPr>
-            <w:tcW w:type="dxa" w:w="3855"/>
+            <w:tcW w:type="dxa" w:w="4415"/>
           </w:tcPr>
           <w:p>
             <w:pPr>
@@ -1743,7 +1743,7 @@
         </w:tc>
         <w:tc>
           <w:tcPr>
-            <w:tcW w:type="dxa" w:w="850"/>
+            <w:tcW w:type="dxa" w:w="974"/>
           </w:tcPr>
           <w:p>
             <w:pPr>
@@ -1760,7 +1760,7 @@
         </w:tc>
         <w:tc>
           <w:tcPr>
-            <w:tcW w:type="dxa" w:w="3005"/>
+            <w:tcW w:type="dxa" w:w="3441"/>
           </w:tcPr>
           <w:p>
             <w:pPr>
@@ -1777,7 +1777,7 @@
         </w:tc>
         <w:tc>
           <w:tcPr>
-            <w:tcW w:type="dxa" w:w="2381"/>
+            <w:tcW w:type="dxa" w:w="2727"/>
           </w:tcPr>
           <w:p>
             <w:pPr>
@@ -1794,7 +1794,7 @@
         </w:tc>
         <w:tc>
           <w:tcPr>
-            <w:tcW w:type="dxa" w:w="1587"/>
+            <w:tcW w:type="dxa" w:w="1818"/>
           </w:tcPr>
           <w:p>
             <w:pPr>
@@ -1816,7 +1816,7 @@
         </w:trPr>
         <w:tc>
           <w:tcPr>
-            <w:tcW w:type="dxa" w:w="567"/>
+            <w:tcW w:type="dxa" w:w="649"/>
             <w:shd w:val="clear" w:color="auto" w:fill="E8F5E9"/>
           </w:tcPr>
           <w:p>
@@ -1834,7 +1834,7 @@
         </w:tc>
         <w:tc>
           <w:tcPr>
-            <w:tcW w:type="dxa" w:w="2835"/>
+            <w:tcW w:type="dxa" w:w="3246"/>
           </w:tcPr>
           <w:p>
             <w:pPr>
@@ -1863,7 +1863,7 @@
         </w:tc>
         <w:tc>
           <w:tcPr>
-            <w:tcW w:type="dxa" w:w="3855"/>
+            <w:tcW w:type="dxa" w:w="4415"/>
           </w:tcPr>
           <w:p>
             <w:pPr>
@@ -1904,7 +1904,7 @@
         </w:tc>
         <w:tc>
           <w:tcPr>
-            <w:tcW w:type="dxa" w:w="850"/>
+            <w:tcW w:type="dxa" w:w="974"/>
           </w:tcPr>
           <w:p>
             <w:pPr>
@@ -1921,7 +1921,7 @@
         </w:tc>
         <w:tc>
           <w:tcPr>
-            <w:tcW w:type="dxa" w:w="3005"/>
+            <w:tcW w:type="dxa" w:w="3441"/>
           </w:tcPr>
           <w:p>
             <w:pPr>
@@ -1938,7 +1938,7 @@
         </w:tc>
         <w:tc>
           <w:tcPr>
-            <w:tcW w:type="dxa" w:w="2381"/>
+            <w:tcW w:type="dxa" w:w="2727"/>
           </w:tcPr>
           <w:p>
             <w:pPr>
@@ -1955,7 +1955,7 @@
         </w:tc>
         <w:tc>
           <w:tcPr>
-            <w:tcW w:type="dxa" w:w="1587"/>
+            <w:tcW w:type="dxa" w:w="1818"/>
           </w:tcPr>
           <w:p>
             <w:pPr>
@@ -1977,7 +1977,7 @@
         </w:trPr>
         <w:tc>
           <w:tcPr>
-            <w:tcW w:type="dxa" w:w="567"/>
+            <w:tcW w:type="dxa" w:w="649"/>
             <w:shd w:val="clear" w:color="auto" w:fill="E8F5E9"/>
           </w:tcPr>
           <w:p>
@@ -1995,7 +1995,7 @@
         </w:tc>
         <w:tc>
           <w:tcPr>
-            <w:tcW w:type="dxa" w:w="2835"/>
+            <w:tcW w:type="dxa" w:w="3246"/>
           </w:tcPr>
           <w:p>
             <w:pPr>
@@ -2012,7 +2012,7 @@
         </w:tc>
         <w:tc>
           <w:tcPr>
-            <w:tcW w:type="dxa" w:w="3855"/>
+            <w:tcW w:type="dxa" w:w="4415"/>
           </w:tcPr>
           <w:p>
             <w:pPr>
@@ -2053,7 +2053,7 @@
         </w:tc>
         <w:tc>
           <w:tcPr>
-            <w:tcW w:type="dxa" w:w="850"/>
+            <w:tcW w:type="dxa" w:w="974"/>
           </w:tcPr>
           <w:p>
             <w:pPr>
@@ -2070,7 +2070,7 @@
         </w:tc>
         <w:tc>
           <w:tcPr>
-            <w:tcW w:type="dxa" w:w="3005"/>
+            <w:tcW w:type="dxa" w:w="3441"/>
           </w:tcPr>
           <w:p>
             <w:pPr>
@@ -2087,7 +2087,7 @@
         </w:tc>
         <w:tc>
           <w:tcPr>
-            <w:tcW w:type="dxa" w:w="2381"/>
+            <w:tcW w:type="dxa" w:w="2727"/>
           </w:tcPr>
           <w:p>
             <w:pPr>
@@ -2104,7 +2104,7 @@
         </w:tc>
         <w:tc>
           <w:tcPr>
-            <w:tcW w:type="dxa" w:w="1587"/>
+            <w:tcW w:type="dxa" w:w="1818"/>
           </w:tcPr>
           <w:p>
             <w:pPr>
@@ -2126,7 +2126,7 @@
         </w:trPr>
         <w:tc>
           <w:tcPr>
-            <w:tcW w:type="dxa" w:w="567"/>
+            <w:tcW w:type="dxa" w:w="649"/>
             <w:shd w:val="clear" w:color="auto" w:fill="E8F5E9"/>
           </w:tcPr>
           <w:p>
@@ -2144,7 +2144,7 @@
         </w:tc>
         <w:tc>
           <w:tcPr>
-            <w:tcW w:type="dxa" w:w="2835"/>
+            <w:tcW w:type="dxa" w:w="3246"/>
           </w:tcPr>
           <w:p>
             <w:pPr>
@@ -2173,7 +2173,7 @@
         </w:tc>
         <w:tc>
           <w:tcPr>
-            <w:tcW w:type="dxa" w:w="3855"/>
+            <w:tcW w:type="dxa" w:w="4415"/>
           </w:tcPr>
           <w:p>
             <w:pPr>
@@ -2214,7 +2214,7 @@
         </w:tc>
         <w:tc>
           <w:tcPr>
-            <w:tcW w:type="dxa" w:w="850"/>
+            <w:tcW w:type="dxa" w:w="974"/>
           </w:tcPr>
           <w:p>
             <w:pPr>
@@ -2231,7 +2231,7 @@
         </w:tc>
         <w:tc>
           <w:tcPr>
-            <w:tcW w:type="dxa" w:w="3005"/>
+            <w:tcW w:type="dxa" w:w="3441"/>
           </w:tcPr>
           <w:p>
             <w:pPr>
@@ -2248,7 +2248,7 @@
         </w:tc>
         <w:tc>
           <w:tcPr>
-            <w:tcW w:type="dxa" w:w="2381"/>
+            <w:tcW w:type="dxa" w:w="2727"/>
           </w:tcPr>
           <w:p>
             <w:pPr>
@@ -2265,7 +2265,7 @@
         </w:tc>
         <w:tc>
           <w:tcPr>
-            <w:tcW w:type="dxa" w:w="1587"/>
+            <w:tcW w:type="dxa" w:w="1818"/>
           </w:tcPr>
           <w:p>
             <w:pPr>
@@ -2287,7 +2287,7 @@
         </w:trPr>
         <w:tc>
           <w:tcPr>
-            <w:tcW w:type="dxa" w:w="567"/>
+            <w:tcW w:type="dxa" w:w="649"/>
             <w:shd w:val="clear" w:color="auto" w:fill="E8F5E9"/>
           </w:tcPr>
           <w:p>
@@ -2305,7 +2305,7 @@
         </w:tc>
         <w:tc>
           <w:tcPr>
-            <w:tcW w:type="dxa" w:w="2835"/>
+            <w:tcW w:type="dxa" w:w="3246"/>
           </w:tcPr>
           <w:p>
             <w:pPr>
@@ -2322,7 +2322,7 @@
         </w:tc>
         <w:tc>
           <w:tcPr>
-            <w:tcW w:type="dxa" w:w="3855"/>
+            <w:tcW w:type="dxa" w:w="4415"/>
           </w:tcPr>
           <w:p>
             <w:pPr>
@@ -2363,7 +2363,7 @@
         </w:tc>
         <w:tc>
           <w:tcPr>
-            <w:tcW w:type="dxa" w:w="850"/>
+            <w:tcW w:type="dxa" w:w="974"/>
           </w:tcPr>
           <w:p>
             <w:pPr>
@@ -2380,7 +2380,7 @@
         </w:tc>
         <w:tc>
           <w:tcPr>
-            <w:tcW w:type="dxa" w:w="3005"/>
+            <w:tcW w:type="dxa" w:w="3441"/>
           </w:tcPr>
           <w:p>
             <w:pPr>
@@ -2397,7 +2397,7 @@
         </w:tc>
         <w:tc>
           <w:tcPr>
-            <w:tcW w:type="dxa" w:w="2381"/>
+            <w:tcW w:type="dxa" w:w="2727"/>
           </w:tcPr>
           <w:p>
             <w:pPr>
@@ -2414,7 +2414,7 @@
         </w:tc>
         <w:tc>
           <w:tcPr>
-            <w:tcW w:type="dxa" w:w="1587"/>
+            <w:tcW w:type="dxa" w:w="1818"/>
           </w:tcPr>
           <w:p>
             <w:pPr>
@@ -2436,7 +2436,7 @@
         </w:trPr>
         <w:tc>
           <w:tcPr>
-            <w:tcW w:type="dxa" w:w="567"/>
+            <w:tcW w:type="dxa" w:w="649"/>
             <w:shd w:val="clear" w:color="auto" w:fill="E8F5E9"/>
           </w:tcPr>
           <w:p>
@@ -2454,7 +2454,7 @@
         </w:tc>
         <w:tc>
           <w:tcPr>
-            <w:tcW w:type="dxa" w:w="2835"/>
+            <w:tcW w:type="dxa" w:w="3246"/>
           </w:tcPr>
           <w:p>
             <w:pPr>
@@ -2483,7 +2483,7 @@
         </w:tc>
         <w:tc>
           <w:tcPr>
-            <w:tcW w:type="dxa" w:w="3855"/>
+            <w:tcW w:type="dxa" w:w="4415"/>
           </w:tcPr>
           <w:p>
             <w:pPr>
@@ -2524,7 +2524,7 @@
         </w:tc>
         <w:tc>
           <w:tcPr>
-            <w:tcW w:type="dxa" w:w="850"/>
+            <w:tcW w:type="dxa" w:w="974"/>
           </w:tcPr>
           <w:p>
             <w:pPr>
@@ -2541,7 +2541,7 @@
         </w:tc>
         <w:tc>
           <w:tcPr>
-            <w:tcW w:type="dxa" w:w="3005"/>
+            <w:tcW w:type="dxa" w:w="3441"/>
           </w:tcPr>
           <w:p>
             <w:pPr>
@@ -2558,7 +2558,7 @@
         </w:tc>
         <w:tc>
           <w:tcPr>
-            <w:tcW w:type="dxa" w:w="2381"/>
+            <w:tcW w:type="dxa" w:w="2727"/>
           </w:tcPr>
           <w:p>
             <w:pPr>
@@ -2575,7 +2575,7 @@
         </w:tc>
         <w:tc>
           <w:tcPr>
-            <w:tcW w:type="dxa" w:w="1587"/>
+            <w:tcW w:type="dxa" w:w="1818"/>
           </w:tcPr>
           <w:p>
             <w:pPr>
@@ -2597,7 +2597,7 @@
         </w:trPr>
         <w:tc>
           <w:tcPr>
-            <w:tcW w:type="dxa" w:w="567"/>
+            <w:tcW w:type="dxa" w:w="649"/>
             <w:shd w:val="clear" w:color="auto" w:fill="E8F5E9"/>
           </w:tcPr>
           <w:p>
@@ -2615,7 +2615,7 @@
         </w:tc>
         <w:tc>
           <w:tcPr>
-            <w:tcW w:type="dxa" w:w="2835"/>
+            <w:tcW w:type="dxa" w:w="3246"/>
           </w:tcPr>
           <w:p>
             <w:pPr>
@@ -2632,7 +2632,7 @@
         </w:tc>
         <w:tc>
           <w:tcPr>
-            <w:tcW w:type="dxa" w:w="3855"/>
+            <w:tcW w:type="dxa" w:w="4415"/>
           </w:tcPr>
           <w:p>
             <w:pPr>
@@ -2673,7 +2673,7 @@
         </w:tc>
         <w:tc>
           <w:tcPr>
-            <w:tcW w:type="dxa" w:w="850"/>
+            <w:tcW w:type="dxa" w:w="974"/>
           </w:tcPr>
           <w:p>
             <w:pPr>
@@ -2690,7 +2690,7 @@
         </w:tc>
         <w:tc>
           <w:tcPr>
-            <w:tcW w:type="dxa" w:w="3005"/>
+            <w:tcW w:type="dxa" w:w="3441"/>
           </w:tcPr>
           <w:p>
             <w:pPr>
@@ -2707,7 +2707,7 @@
         </w:tc>
         <w:tc>
           <w:tcPr>
-            <w:tcW w:type="dxa" w:w="2381"/>
+            <w:tcW w:type="dxa" w:w="2727"/>
           </w:tcPr>
           <w:p>
             <w:pPr>
@@ -2724,7 +2724,7 @@
         </w:tc>
         <w:tc>
           <w:tcPr>
-            <w:tcW w:type="dxa" w:w="1587"/>
+            <w:tcW w:type="dxa" w:w="1818"/>
           </w:tcPr>
           <w:p>
             <w:pPr>
@@ -2746,7 +2746,7 @@
         </w:trPr>
         <w:tc>
           <w:tcPr>
-            <w:tcW w:type="dxa" w:w="567"/>
+            <w:tcW w:type="dxa" w:w="649"/>
             <w:shd w:val="clear" w:color="auto" w:fill="E8F5E9"/>
           </w:tcPr>
           <w:p>
@@ -2764,7 +2764,7 @@
         </w:tc>
         <w:tc>
           <w:tcPr>
-            <w:tcW w:type="dxa" w:w="2835"/>
+            <w:tcW w:type="dxa" w:w="3246"/>
           </w:tcPr>
           <w:p>
             <w:pPr>
@@ -2793,7 +2793,7 @@
         </w:tc>
         <w:tc>
           <w:tcPr>
-            <w:tcW w:type="dxa" w:w="3855"/>
+            <w:tcW w:type="dxa" w:w="4415"/>
           </w:tcPr>
           <w:p>
             <w:pPr>
@@ -2834,7 +2834,7 @@
         </w:tc>
         <w:tc>
           <w:tcPr>
-            <w:tcW w:type="dxa" w:w="850"/>
+            <w:tcW w:type="dxa" w:w="974"/>
           </w:tcPr>
           <w:p>
             <w:pPr>
@@ -2851,7 +2851,7 @@
         </w:tc>
         <w:tc>
           <w:tcPr>
-            <w:tcW w:type="dxa" w:w="3005"/>
+            <w:tcW w:type="dxa" w:w="3441"/>
           </w:tcPr>
           <w:p>
             <w:pPr>
@@ -2868,7 +2868,7 @@
         </w:tc>
         <w:tc>
           <w:tcPr>
-            <w:tcW w:type="dxa" w:w="2381"/>
+            <w:tcW w:type="dxa" w:w="2727"/>
           </w:tcPr>
           <w:p>
             <w:pPr>
@@ -2885,7 +2885,7 @@
         </w:tc>
         <w:tc>
           <w:tcPr>
-            <w:tcW w:type="dxa" w:w="1587"/>
+            <w:tcW w:type="dxa" w:w="1818"/>
           </w:tcPr>
           <w:p>
             <w:pPr>
@@ -2907,7 +2907,7 @@
         </w:trPr>
         <w:tc>
           <w:tcPr>
-            <w:tcW w:type="dxa" w:w="567"/>
+            <w:tcW w:type="dxa" w:w="649"/>
             <w:shd w:val="clear" w:color="auto" w:fill="E8F5E9"/>
           </w:tcPr>
           <w:p>
@@ -2925,7 +2925,7 @@
         </w:tc>
         <w:tc>
           <w:tcPr>
-            <w:tcW w:type="dxa" w:w="2835"/>
+            <w:tcW w:type="dxa" w:w="3246"/>
           </w:tcPr>
           <w:p>
             <w:pPr>
@@ -2954,7 +2954,7 @@
         </w:tc>
         <w:tc>
           <w:tcPr>
-            <w:tcW w:type="dxa" w:w="3855"/>
+            <w:tcW w:type="dxa" w:w="4415"/>
           </w:tcPr>
           <w:p>
             <w:pPr>
@@ -2995,7 +2995,7 @@
         </w:tc>
         <w:tc>
           <w:tcPr>
-            <w:tcW w:type="dxa" w:w="850"/>
+            <w:tcW w:type="dxa" w:w="974"/>
           </w:tcPr>
           <w:p>
             <w:pPr>
@@ -3012,7 +3012,7 @@
         </w:tc>
         <w:tc>
           <w:tcPr>
-            <w:tcW w:type="dxa" w:w="3005"/>
+            <w:tcW w:type="dxa" w:w="3441"/>
           </w:tcPr>
           <w:p>
             <w:pPr>
@@ -3029,7 +3029,7 @@
         </w:tc>
         <w:tc>
           <w:tcPr>
-            <w:tcW w:type="dxa" w:w="2381"/>
+            <w:tcW w:type="dxa" w:w="2727"/>
           </w:tcPr>
           <w:p>
             <w:pPr>
@@ -3046,7 +3046,7 @@
         </w:tc>
         <w:tc>
           <w:tcPr>
-            <w:tcW w:type="dxa" w:w="1587"/>
+            <w:tcW w:type="dxa" w:w="1818"/>
           </w:tcPr>
           <w:p>
             <w:pPr>
@@ -3068,7 +3068,7 @@
         </w:trPr>
         <w:tc>
           <w:tcPr>
-            <w:tcW w:type="dxa" w:w="567"/>
+            <w:tcW w:type="dxa" w:w="649"/>
             <w:shd w:val="clear" w:color="auto" w:fill="E8F5E9"/>
           </w:tcPr>
           <w:p>
@@ -3086,7 +3086,7 @@
         </w:tc>
         <w:tc>
           <w:tcPr>
-            <w:tcW w:type="dxa" w:w="2835"/>
+            <w:tcW w:type="dxa" w:w="3246"/>
           </w:tcPr>
           <w:p>
             <w:pPr>
@@ -3115,7 +3115,7 @@
         </w:tc>
         <w:tc>
           <w:tcPr>
-            <w:tcW w:type="dxa" w:w="3855"/>
+            <w:tcW w:type="dxa" w:w="4415"/>
           </w:tcPr>
           <w:p>
             <w:pPr>
@@ -3156,7 +3156,7 @@
         </w:tc>
         <w:tc>
           <w:tcPr>
-            <w:tcW w:type="dxa" w:w="850"/>
+            <w:tcW w:type="dxa" w:w="974"/>
           </w:tcPr>
           <w:p>
             <w:pPr>
@@ -3173,7 +3173,7 @@
         </w:tc>
         <w:tc>
           <w:tcPr>
-            <w:tcW w:type="dxa" w:w="3005"/>
+            <w:tcW w:type="dxa" w:w="3441"/>
           </w:tcPr>
           <w:p>
             <w:pPr>
@@ -3190,7 +3190,7 @@
         </w:tc>
         <w:tc>
           <w:tcPr>
-            <w:tcW w:type="dxa" w:w="2381"/>
+            <w:tcW w:type="dxa" w:w="2727"/>
           </w:tcPr>
           <w:p>
             <w:pPr>
@@ -3207,7 +3207,7 @@
         </w:tc>
         <w:tc>
           <w:tcPr>
-            <w:tcW w:type="dxa" w:w="1587"/>
+            <w:tcW w:type="dxa" w:w="1818"/>
           </w:tcPr>
           <w:p>
             <w:pPr>
@@ -3229,7 +3229,7 @@
         </w:trPr>
         <w:tc>
           <w:tcPr>
-            <w:tcW w:type="dxa" w:w="567"/>
+            <w:tcW w:type="dxa" w:w="649"/>
             <w:shd w:val="clear" w:color="auto" w:fill="E8F5E9"/>
           </w:tcPr>
           <w:p>
@@ -3247,7 +3247,7 @@
         </w:tc>
         <w:tc>
           <w:tcPr>
-            <w:tcW w:type="dxa" w:w="2835"/>
+            <w:tcW w:type="dxa" w:w="3246"/>
           </w:tcPr>
           <w:p>
             <w:pPr>
@@ -3264,7 +3264,7 @@
         </w:tc>
         <w:tc>
           <w:tcPr>
-            <w:tcW w:type="dxa" w:w="3855"/>
+            <w:tcW w:type="dxa" w:w="4415"/>
           </w:tcPr>
           <w:p>
             <w:pPr>
@@ -3305,7 +3305,7 @@
         </w:tc>
         <w:tc>
           <w:tcPr>
-            <w:tcW w:type="dxa" w:w="850"/>
+            <w:tcW w:type="dxa" w:w="974"/>
           </w:tcPr>
           <w:p>
             <w:pPr>
@@ -3322,7 +3322,7 @@
         </w:tc>
         <w:tc>
           <w:tcPr>
-            <w:tcW w:type="dxa" w:w="3005"/>
+            <w:tcW w:type="dxa" w:w="3441"/>
           </w:tcPr>
           <w:p>
             <w:pPr>
@@ -3339,7 +3339,7 @@
         </w:tc>
         <w:tc>
           <w:tcPr>
-            <w:tcW w:type="dxa" w:w="2381"/>
+            <w:tcW w:type="dxa" w:w="2727"/>
           </w:tcPr>
           <w:p>
             <w:pPr>
@@ -3356,7 +3356,7 @@
         </w:tc>
         <w:tc>
           <w:tcPr>
-            <w:tcW w:type="dxa" w:w="1587"/>
+            <w:tcW w:type="dxa" w:w="1818"/>
           </w:tcPr>
           <w:p>
             <w:pPr>
@@ -3378,7 +3378,7 @@
         </w:trPr>
         <w:tc>
           <w:tcPr>
-            <w:tcW w:type="dxa" w:w="567"/>
+            <w:tcW w:type="dxa" w:w="649"/>
             <w:shd w:val="clear" w:color="auto" w:fill="EAF0F6"/>
           </w:tcPr>
           <w:p>
@@ -3396,7 +3396,7 @@
         </w:tc>
         <w:tc>
           <w:tcPr>
-            <w:tcW w:type="dxa" w:w="2835"/>
+            <w:tcW w:type="dxa" w:w="3246"/>
             <w:shd w:val="clear" w:color="auto" w:fill="EAF0F6"/>
           </w:tcPr>
           <w:p>
@@ -3414,7 +3414,7 @@
         </w:tc>
         <w:tc>
           <w:tcPr>
-            <w:tcW w:type="dxa" w:w="3855"/>
+            <w:tcW w:type="dxa" w:w="4415"/>
             <w:shd w:val="clear" w:color="auto" w:fill="EAF0F6"/>
           </w:tcPr>
           <w:p>
@@ -3456,7 +3456,7 @@
         </w:tc>
         <w:tc>
           <w:tcPr>
-            <w:tcW w:type="dxa" w:w="850"/>
+            <w:tcW w:type="dxa" w:w="974"/>
             <w:shd w:val="clear" w:color="auto" w:fill="EAF0F6"/>
           </w:tcPr>
           <w:p>
@@ -3474,7 +3474,7 @@
         </w:tc>
         <w:tc>
           <w:tcPr>
-            <w:tcW w:type="dxa" w:w="3005"/>
+            <w:tcW w:type="dxa" w:w="3441"/>
             <w:shd w:val="clear" w:color="auto" w:fill="EAF0F6"/>
           </w:tcPr>
           <w:p>
@@ -3492,7 +3492,7 @@
         </w:tc>
         <w:tc>
           <w:tcPr>
-            <w:tcW w:type="dxa" w:w="2381"/>
+            <w:tcW w:type="dxa" w:w="2727"/>
             <w:shd w:val="clear" w:color="auto" w:fill="EAF0F6"/>
           </w:tcPr>
           <w:p>
@@ -3510,7 +3510,7 @@
         </w:tc>
         <w:tc>
           <w:tcPr>
-            <w:tcW w:type="dxa" w:w="1587"/>
+            <w:tcW w:type="dxa" w:w="1818"/>
             <w:shd w:val="clear" w:color="auto" w:fill="EAF0F6"/>
           </w:tcPr>
           <w:p>
@@ -3533,7 +3533,7 @@
         </w:trPr>
         <w:tc>
           <w:tcPr>
-            <w:tcW w:type="dxa" w:w="15080"/>
+            <w:tcW w:type="dxa" w:w="17270"/>
             <w:gridSpan w:val="7"/>
             <w:shd w:val="clear" w:color="auto" w:fill="1B4F72"/>
           </w:tcPr>
@@ -3558,7 +3558,7 @@
         </w:trPr>
         <w:tc>
           <w:tcPr>
-            <w:tcW w:type="dxa" w:w="15080"/>
+            <w:tcW w:type="dxa" w:w="17270"/>
             <w:gridSpan w:val="7"/>
             <w:shd w:val="clear" w:color="auto" w:fill="2E7D32"/>
           </w:tcPr>
@@ -3583,7 +3583,7 @@
         </w:trPr>
         <w:tc>
           <w:tcPr>
-            <w:tcW w:type="dxa" w:w="567"/>
+            <w:tcW w:type="dxa" w:w="649"/>
             <w:shd w:val="clear" w:color="auto" w:fill="E8F5E9"/>
           </w:tcPr>
           <w:p>
@@ -3601,7 +3601,7 @@
         </w:tc>
         <w:tc>
           <w:tcPr>
-            <w:tcW w:type="dxa" w:w="2835"/>
+            <w:tcW w:type="dxa" w:w="3246"/>
           </w:tcPr>
           <w:p>
             <w:pPr>
@@ -3630,7 +3630,7 @@
         </w:tc>
         <w:tc>
           <w:tcPr>
-            <w:tcW w:type="dxa" w:w="3855"/>
+            <w:tcW w:type="dxa" w:w="4415"/>
           </w:tcPr>
           <w:p>
             <w:pPr>
@@ -3671,7 +3671,7 @@
         </w:tc>
         <w:tc>
           <w:tcPr>
-            <w:tcW w:type="dxa" w:w="850"/>
+            <w:tcW w:type="dxa" w:w="974"/>
           </w:tcPr>
           <w:p>
             <w:pPr>
@@ -3688,7 +3688,7 @@
         </w:tc>
         <w:tc>
           <w:tcPr>
-            <w:tcW w:type="dxa" w:w="3005"/>
+            <w:tcW w:type="dxa" w:w="3441"/>
           </w:tcPr>
           <w:p>
             <w:pPr>
@@ -3705,7 +3705,7 @@
         </w:tc>
         <w:tc>
           <w:tcPr>
-            <w:tcW w:type="dxa" w:w="2381"/>
+            <w:tcW w:type="dxa" w:w="2727"/>
           </w:tcPr>
           <w:p>
             <w:pPr>
@@ -3722,7 +3722,7 @@
         </w:tc>
         <w:tc>
           <w:tcPr>
-            <w:tcW w:type="dxa" w:w="1587"/>
+            <w:tcW w:type="dxa" w:w="1818"/>
           </w:tcPr>
           <w:p>
             <w:pPr>
@@ -3744,7 +3744,7 @@
         </w:trPr>
         <w:tc>
           <w:tcPr>
-            <w:tcW w:type="dxa" w:w="567"/>
+            <w:tcW w:type="dxa" w:w="649"/>
             <w:shd w:val="clear" w:color="auto" w:fill="E8F5E9"/>
           </w:tcPr>
           <w:p>
@@ -3762,7 +3762,7 @@
         </w:tc>
         <w:tc>
           <w:tcPr>
-            <w:tcW w:type="dxa" w:w="2835"/>
+            <w:tcW w:type="dxa" w:w="3246"/>
           </w:tcPr>
           <w:p>
             <w:pPr>
@@ -3791,7 +3791,7 @@
         </w:tc>
         <w:tc>
           <w:tcPr>
-            <w:tcW w:type="dxa" w:w="3855"/>
+            <w:tcW w:type="dxa" w:w="4415"/>
           </w:tcPr>
           <w:p>
             <w:pPr>
@@ -3832,7 +3832,7 @@
         </w:tc>
         <w:tc>
           <w:tcPr>
-            <w:tcW w:type="dxa" w:w="850"/>
+            <w:tcW w:type="dxa" w:w="974"/>
           </w:tcPr>
           <w:p>
             <w:pPr>
@@ -3849,7 +3849,7 @@
         </w:tc>
         <w:tc>
           <w:tcPr>
-            <w:tcW w:type="dxa" w:w="3005"/>
+            <w:tcW w:type="dxa" w:w="3441"/>
           </w:tcPr>
           <w:p>
             <w:pPr>
@@ -3866,7 +3866,7 @@
         </w:tc>
         <w:tc>
           <w:tcPr>
-            <w:tcW w:type="dxa" w:w="2381"/>
+            <w:tcW w:type="dxa" w:w="2727"/>
           </w:tcPr>
           <w:p>
             <w:pPr>
@@ -3883,7 +3883,7 @@
         </w:tc>
         <w:tc>
           <w:tcPr>
-            <w:tcW w:type="dxa" w:w="1587"/>
+            <w:tcW w:type="dxa" w:w="1818"/>
           </w:tcPr>
           <w:p>
             <w:pPr>
@@ -3905,7 +3905,7 @@
         </w:trPr>
         <w:tc>
           <w:tcPr>
-            <w:tcW w:type="dxa" w:w="567"/>
+            <w:tcW w:type="dxa" w:w="649"/>
             <w:shd w:val="clear" w:color="auto" w:fill="E8F5E9"/>
           </w:tcPr>
           <w:p>
@@ -3923,7 +3923,7 @@
         </w:tc>
         <w:tc>
           <w:tcPr>
-            <w:tcW w:type="dxa" w:w="2835"/>
+            <w:tcW w:type="dxa" w:w="3246"/>
           </w:tcPr>
           <w:p>
             <w:pPr>
@@ -3940,7 +3940,7 @@
         </w:tc>
         <w:tc>
           <w:tcPr>
-            <w:tcW w:type="dxa" w:w="3855"/>
+            <w:tcW w:type="dxa" w:w="4415"/>
           </w:tcPr>
           <w:p>
             <w:pPr>
@@ -3981,7 +3981,7 @@
         </w:tc>
         <w:tc>
           <w:tcPr>
-            <w:tcW w:type="dxa" w:w="850"/>
+            <w:tcW w:type="dxa" w:w="974"/>
           </w:tcPr>
           <w:p>
             <w:pPr>
@@ -3998,7 +3998,7 @@
         </w:tc>
         <w:tc>
           <w:tcPr>
-            <w:tcW w:type="dxa" w:w="3005"/>
+            <w:tcW w:type="dxa" w:w="3441"/>
           </w:tcPr>
           <w:p>
             <w:pPr>
@@ -4015,7 +4015,7 @@
         </w:tc>
         <w:tc>
           <w:tcPr>
-            <w:tcW w:type="dxa" w:w="2381"/>
+            <w:tcW w:type="dxa" w:w="2727"/>
           </w:tcPr>
           <w:p>
             <w:pPr>
@@ -4032,7 +4032,7 @@
         </w:tc>
         <w:tc>
           <w:tcPr>
-            <w:tcW w:type="dxa" w:w="1587"/>
+            <w:tcW w:type="dxa" w:w="1818"/>
           </w:tcPr>
           <w:p>
             <w:pPr>
@@ -4054,7 +4054,7 @@
         </w:trPr>
         <w:tc>
           <w:tcPr>
-            <w:tcW w:type="dxa" w:w="567"/>
+            <w:tcW w:type="dxa" w:w="649"/>
             <w:shd w:val="clear" w:color="auto" w:fill="E8F5E9"/>
           </w:tcPr>
           <w:p>
@@ -4072,7 +4072,7 @@
         </w:tc>
         <w:tc>
           <w:tcPr>
-            <w:tcW w:type="dxa" w:w="2835"/>
+            <w:tcW w:type="dxa" w:w="3246"/>
           </w:tcPr>
           <w:p>
             <w:pPr>
@@ -4101,7 +4101,7 @@
         </w:tc>
         <w:tc>
           <w:tcPr>
-            <w:tcW w:type="dxa" w:w="3855"/>
+            <w:tcW w:type="dxa" w:w="4415"/>
           </w:tcPr>
           <w:p>
             <w:pPr>
@@ -4142,7 +4142,7 @@
         </w:tc>
         <w:tc>
           <w:tcPr>
-            <w:tcW w:type="dxa" w:w="850"/>
+            <w:tcW w:type="dxa" w:w="974"/>
           </w:tcPr>
           <w:p>
             <w:pPr>
@@ -4159,7 +4159,7 @@
         </w:tc>
         <w:tc>
           <w:tcPr>
-            <w:tcW w:type="dxa" w:w="3005"/>
+            <w:tcW w:type="dxa" w:w="3441"/>
           </w:tcPr>
           <w:p>
             <w:pPr>
@@ -4176,7 +4176,7 @@
         </w:tc>
         <w:tc>
           <w:tcPr>
-            <w:tcW w:type="dxa" w:w="2381"/>
+            <w:tcW w:type="dxa" w:w="2727"/>
           </w:tcPr>
           <w:p>
             <w:pPr>
@@ -4193,7 +4193,7 @@
         </w:tc>
         <w:tc>
           <w:tcPr>
-            <w:tcW w:type="dxa" w:w="1587"/>
+            <w:tcW w:type="dxa" w:w="1818"/>
           </w:tcPr>
           <w:p>
             <w:pPr>
@@ -4215,7 +4215,7 @@
         </w:trPr>
         <w:tc>
           <w:tcPr>
-            <w:tcW w:type="dxa" w:w="567"/>
+            <w:tcW w:type="dxa" w:w="649"/>
             <w:shd w:val="clear" w:color="auto" w:fill="E8F5E9"/>
           </w:tcPr>
           <w:p>
@@ -4233,7 +4233,7 @@
         </w:tc>
         <w:tc>
           <w:tcPr>
-            <w:tcW w:type="dxa" w:w="2835"/>
+            <w:tcW w:type="dxa" w:w="3246"/>
           </w:tcPr>
           <w:p>
             <w:pPr>
@@ -4262,7 +4262,7 @@
         </w:tc>
         <w:tc>
           <w:tcPr>
-            <w:tcW w:type="dxa" w:w="3855"/>
+            <w:tcW w:type="dxa" w:w="4415"/>
           </w:tcPr>
           <w:p>
             <w:pPr>
@@ -4303,7 +4303,7 @@
         </w:tc>
         <w:tc>
           <w:tcPr>
-            <w:tcW w:type="dxa" w:w="850"/>
+            <w:tcW w:type="dxa" w:w="974"/>
           </w:tcPr>
           <w:p>
             <w:pPr>
@@ -4320,7 +4320,7 @@
         </w:tc>
         <w:tc>
           <w:tcPr>
-            <w:tcW w:type="dxa" w:w="3005"/>
+            <w:tcW w:type="dxa" w:w="3441"/>
           </w:tcPr>
           <w:p>
             <w:pPr>
@@ -4337,7 +4337,7 @@
         </w:tc>
         <w:tc>
           <w:tcPr>
-            <w:tcW w:type="dxa" w:w="2381"/>
+            <w:tcW w:type="dxa" w:w="2727"/>
           </w:tcPr>
           <w:p>
             <w:pPr>
@@ -4354,7 +4354,7 @@
         </w:tc>
         <w:tc>
           <w:tcPr>
-            <w:tcW w:type="dxa" w:w="1587"/>
+            <w:tcW w:type="dxa" w:w="1818"/>
           </w:tcPr>
           <w:p>
             <w:pPr>
@@ -4376,7 +4376,7 @@
         </w:trPr>
         <w:tc>
           <w:tcPr>
-            <w:tcW w:type="dxa" w:w="567"/>
+            <w:tcW w:type="dxa" w:w="649"/>
             <w:shd w:val="clear" w:color="auto" w:fill="E8F5E9"/>
           </w:tcPr>
           <w:p>
@@ -4394,7 +4394,7 @@
         </w:tc>
         <w:tc>
           <w:tcPr>
-            <w:tcW w:type="dxa" w:w="2835"/>
+            <w:tcW w:type="dxa" w:w="3246"/>
           </w:tcPr>
           <w:p>
             <w:pPr>
@@ -4411,7 +4411,7 @@
         </w:tc>
         <w:tc>
           <w:tcPr>
-            <w:tcW w:type="dxa" w:w="3855"/>
+            <w:tcW w:type="dxa" w:w="4415"/>
           </w:tcPr>
           <w:p>
             <w:pPr>
@@ -4452,7 +4452,7 @@
         </w:tc>
         <w:tc>
           <w:tcPr>
-            <w:tcW w:type="dxa" w:w="850"/>
+            <w:tcW w:type="dxa" w:w="974"/>
           </w:tcPr>
           <w:p>
             <w:pPr>
@@ -4469,7 +4469,7 @@
         </w:tc>
         <w:tc>
           <w:tcPr>
-            <w:tcW w:type="dxa" w:w="3005"/>
+            <w:tcW w:type="dxa" w:w="3441"/>
           </w:tcPr>
           <w:p>
             <w:pPr>
@@ -4486,7 +4486,7 @@
         </w:tc>
         <w:tc>
           <w:tcPr>
-            <w:tcW w:type="dxa" w:w="2381"/>
+            <w:tcW w:type="dxa" w:w="2727"/>
           </w:tcPr>
           <w:p>
             <w:pPr>
@@ -4503,7 +4503,7 @@
         </w:tc>
         <w:tc>
           <w:tcPr>
-            <w:tcW w:type="dxa" w:w="1587"/>
+            <w:tcW w:type="dxa" w:w="1818"/>
           </w:tcPr>
           <w:p>
             <w:pPr>
@@ -4525,7 +4525,7 @@
         </w:trPr>
         <w:tc>
           <w:tcPr>
-            <w:tcW w:type="dxa" w:w="567"/>
+            <w:tcW w:type="dxa" w:w="649"/>
             <w:shd w:val="clear" w:color="auto" w:fill="E8F5E9"/>
           </w:tcPr>
           <w:p>
@@ -4543,7 +4543,7 @@
         </w:tc>
         <w:tc>
           <w:tcPr>
-            <w:tcW w:type="dxa" w:w="2835"/>
+            <w:tcW w:type="dxa" w:w="3246"/>
           </w:tcPr>
           <w:p>
             <w:pPr>
@@ -4572,7 +4572,7 @@
         </w:tc>
         <w:tc>
           <w:tcPr>
-            <w:tcW w:type="dxa" w:w="3855"/>
+            <w:tcW w:type="dxa" w:w="4415"/>
           </w:tcPr>
           <w:p>
             <w:pPr>
@@ -4613,7 +4613,7 @@
         </w:tc>
         <w:tc>
           <w:tcPr>
-            <w:tcW w:type="dxa" w:w="850"/>
+            <w:tcW w:type="dxa" w:w="974"/>
           </w:tcPr>
           <w:p>
             <w:pPr>
@@ -4630,7 +4630,7 @@
         </w:tc>
         <w:tc>
           <w:tcPr>
-            <w:tcW w:type="dxa" w:w="3005"/>
+            <w:tcW w:type="dxa" w:w="3441"/>
           </w:tcPr>
           <w:p>
             <w:pPr>
@@ -4647,7 +4647,7 @@
         </w:tc>
         <w:tc>
           <w:tcPr>
-            <w:tcW w:type="dxa" w:w="2381"/>
+            <w:tcW w:type="dxa" w:w="2727"/>
           </w:tcPr>
           <w:p>
             <w:pPr>
@@ -4664,7 +4664,7 @@
         </w:tc>
         <w:tc>
           <w:tcPr>
-            <w:tcW w:type="dxa" w:w="1587"/>
+            <w:tcW w:type="dxa" w:w="1818"/>
           </w:tcPr>
           <w:p>
             <w:pPr>
@@ -4686,7 +4686,7 @@
         </w:trPr>
         <w:tc>
           <w:tcPr>
-            <w:tcW w:type="dxa" w:w="567"/>
+            <w:tcW w:type="dxa" w:w="649"/>
             <w:shd w:val="clear" w:color="auto" w:fill="E8F5E9"/>
           </w:tcPr>
           <w:p>
@@ -4704,7 +4704,7 @@
         </w:tc>
         <w:tc>
           <w:tcPr>
-            <w:tcW w:type="dxa" w:w="2835"/>
+            <w:tcW w:type="dxa" w:w="3246"/>
           </w:tcPr>
           <w:p>
             <w:pPr>
@@ -4721,7 +4721,7 @@
         </w:tc>
         <w:tc>
           <w:tcPr>
-            <w:tcW w:type="dxa" w:w="3855"/>
+            <w:tcW w:type="dxa" w:w="4415"/>
           </w:tcPr>
           <w:p>
             <w:pPr>
@@ -4762,7 +4762,7 @@
         </w:tc>
         <w:tc>
           <w:tcPr>
-            <w:tcW w:type="dxa" w:w="850"/>
+            <w:tcW w:type="dxa" w:w="974"/>
           </w:tcPr>
           <w:p>
             <w:pPr>
@@ -4779,7 +4779,7 @@
         </w:tc>
         <w:tc>
           <w:tcPr>
-            <w:tcW w:type="dxa" w:w="3005"/>
+            <w:tcW w:type="dxa" w:w="3441"/>
           </w:tcPr>
           <w:p>
             <w:pPr>
@@ -4796,7 +4796,7 @@
         </w:tc>
         <w:tc>
           <w:tcPr>
-            <w:tcW w:type="dxa" w:w="2381"/>
+            <w:tcW w:type="dxa" w:w="2727"/>
           </w:tcPr>
           <w:p>
             <w:pPr>
@@ -4813,7 +4813,7 @@
         </w:tc>
         <w:tc>
           <w:tcPr>
-            <w:tcW w:type="dxa" w:w="1587"/>
+            <w:tcW w:type="dxa" w:w="1818"/>
           </w:tcPr>
           <w:p>
             <w:pPr>
@@ -4835,7 +4835,7 @@
         </w:trPr>
         <w:tc>
           <w:tcPr>
-            <w:tcW w:type="dxa" w:w="567"/>
+            <w:tcW w:type="dxa" w:w="649"/>
             <w:shd w:val="clear" w:color="auto" w:fill="E8F5E9"/>
           </w:tcPr>
           <w:p>
@@ -4853,7 +4853,7 @@
         </w:tc>
         <w:tc>
           <w:tcPr>
-            <w:tcW w:type="dxa" w:w="2835"/>
+            <w:tcW w:type="dxa" w:w="3246"/>
           </w:tcPr>
           <w:p>
             <w:pPr>
@@ -4882,7 +4882,7 @@
         </w:tc>
         <w:tc>
           <w:tcPr>
-            <w:tcW w:type="dxa" w:w="3855"/>
+            <w:tcW w:type="dxa" w:w="4415"/>
           </w:tcPr>
           <w:p>
             <w:pPr>
@@ -4923,7 +4923,7 @@
         </w:tc>
         <w:tc>
           <w:tcPr>
-            <w:tcW w:type="dxa" w:w="850"/>
+            <w:tcW w:type="dxa" w:w="974"/>
           </w:tcPr>
           <w:p>
             <w:pPr>
@@ -4940,7 +4940,7 @@
         </w:tc>
         <w:tc>
           <w:tcPr>
-            <w:tcW w:type="dxa" w:w="3005"/>
+            <w:tcW w:type="dxa" w:w="3441"/>
           </w:tcPr>
           <w:p>
             <w:pPr>
@@ -4957,7 +4957,7 @@
         </w:tc>
         <w:tc>
           <w:tcPr>
-            <w:tcW w:type="dxa" w:w="2381"/>
+            <w:tcW w:type="dxa" w:w="2727"/>
           </w:tcPr>
           <w:p>
             <w:pPr>
@@ -4974,7 +4974,7 @@
         </w:tc>
         <w:tc>
           <w:tcPr>
-            <w:tcW w:type="dxa" w:w="1587"/>
+            <w:tcW w:type="dxa" w:w="1818"/>
           </w:tcPr>
           <w:p>
             <w:pPr>
@@ -4996,7 +4996,7 @@
         </w:trPr>
         <w:tc>
           <w:tcPr>
-            <w:tcW w:type="dxa" w:w="567"/>
+            <w:tcW w:type="dxa" w:w="649"/>
             <w:shd w:val="clear" w:color="auto" w:fill="E8F5E9"/>
           </w:tcPr>
           <w:p>
@@ -5014,7 +5014,7 @@
         </w:tc>
         <w:tc>
           <w:tcPr>
-            <w:tcW w:type="dxa" w:w="2835"/>
+            <w:tcW w:type="dxa" w:w="3246"/>
           </w:tcPr>
           <w:p>
             <w:pPr>
@@ -5031,7 +5031,7 @@
         </w:tc>
         <w:tc>
           <w:tcPr>
-            <w:tcW w:type="dxa" w:w="3855"/>
+            <w:tcW w:type="dxa" w:w="4415"/>
           </w:tcPr>
           <w:p>
             <w:pPr>
@@ -5072,7 +5072,7 @@
         </w:tc>
         <w:tc>
           <w:tcPr>
-            <w:tcW w:type="dxa" w:w="850"/>
+            <w:tcW w:type="dxa" w:w="974"/>
           </w:tcPr>
           <w:p>
             <w:pPr>
@@ -5089,7 +5089,7 @@
         </w:tc>
         <w:tc>
           <w:tcPr>
-            <w:tcW w:type="dxa" w:w="3005"/>
+            <w:tcW w:type="dxa" w:w="3441"/>
           </w:tcPr>
           <w:p>
             <w:pPr>
@@ -5106,7 +5106,7 @@
         </w:tc>
         <w:tc>
           <w:tcPr>
-            <w:tcW w:type="dxa" w:w="2381"/>
+            <w:tcW w:type="dxa" w:w="2727"/>
           </w:tcPr>
           <w:p>
             <w:pPr>
@@ -5123,7 +5123,7 @@
         </w:tc>
         <w:tc>
           <w:tcPr>
-            <w:tcW w:type="dxa" w:w="1587"/>
+            <w:tcW w:type="dxa" w:w="1818"/>
           </w:tcPr>
           <w:p>
             <w:pPr>
@@ -5145,7 +5145,7 @@
         </w:trPr>
         <w:tc>
           <w:tcPr>
-            <w:tcW w:type="dxa" w:w="567"/>
+            <w:tcW w:type="dxa" w:w="649"/>
             <w:shd w:val="clear" w:color="auto" w:fill="E8F5E9"/>
           </w:tcPr>
           <w:p>
@@ -5163,7 +5163,7 @@
         </w:tc>
         <w:tc>
           <w:tcPr>
-            <w:tcW w:type="dxa" w:w="2835"/>
+            <w:tcW w:type="dxa" w:w="3246"/>
           </w:tcPr>
           <w:p>
             <w:pPr>
@@ -5192,7 +5192,7 @@
         </w:tc>
         <w:tc>
           <w:tcPr>
-            <w:tcW w:type="dxa" w:w="3855"/>
+            <w:tcW w:type="dxa" w:w="4415"/>
           </w:tcPr>
           <w:p>
             <w:pPr>
@@ -5233,7 +5233,7 @@
         </w:tc>
         <w:tc>
           <w:tcPr>
-            <w:tcW w:type="dxa" w:w="850"/>
+            <w:tcW w:type="dxa" w:w="974"/>
           </w:tcPr>
           <w:p>
             <w:pPr>
@@ -5250,7 +5250,7 @@
         </w:tc>
         <w:tc>
           <w:tcPr>
-            <w:tcW w:type="dxa" w:w="3005"/>
+            <w:tcW w:type="dxa" w:w="3441"/>
           </w:tcPr>
           <w:p>
             <w:pPr>
@@ -5267,7 +5267,7 @@
         </w:tc>
         <w:tc>
           <w:tcPr>
-            <w:tcW w:type="dxa" w:w="2381"/>
+            <w:tcW w:type="dxa" w:w="2727"/>
           </w:tcPr>
           <w:p>
             <w:pPr>
@@ -5284,7 +5284,7 @@
         </w:tc>
         <w:tc>
           <w:tcPr>
-            <w:tcW w:type="dxa" w:w="1587"/>
+            <w:tcW w:type="dxa" w:w="1818"/>
           </w:tcPr>
           <w:p>
             <w:pPr>
@@ -5306,7 +5306,7 @@
         </w:trPr>
         <w:tc>
           <w:tcPr>
-            <w:tcW w:type="dxa" w:w="567"/>
+            <w:tcW w:type="dxa" w:w="649"/>
             <w:shd w:val="clear" w:color="auto" w:fill="E8F5E9"/>
           </w:tcPr>
           <w:p>
@@ -5324,7 +5324,7 @@
         </w:tc>
         <w:tc>
           <w:tcPr>
-            <w:tcW w:type="dxa" w:w="2835"/>
+            <w:tcW w:type="dxa" w:w="3246"/>
           </w:tcPr>
           <w:p>
             <w:pPr>
@@ -5341,7 +5341,7 @@
         </w:tc>
         <w:tc>
           <w:tcPr>
-            <w:tcW w:type="dxa" w:w="3855"/>
+            <w:tcW w:type="dxa" w:w="4415"/>
           </w:tcPr>
           <w:p>
             <w:pPr>
@@ -5382,7 +5382,7 @@
         </w:tc>
         <w:tc>
           <w:tcPr>
-            <w:tcW w:type="dxa" w:w="850"/>
+            <w:tcW w:type="dxa" w:w="974"/>
           </w:tcPr>
           <w:p>
             <w:pPr>
@@ -5399,7 +5399,7 @@
         </w:tc>
         <w:tc>
           <w:tcPr>
-            <w:tcW w:type="dxa" w:w="3005"/>
+            <w:tcW w:type="dxa" w:w="3441"/>
           </w:tcPr>
           <w:p>
             <w:pPr>
@@ -5416,7 +5416,7 @@
         </w:tc>
         <w:tc>
           <w:tcPr>
-            <w:tcW w:type="dxa" w:w="2381"/>
+            <w:tcW w:type="dxa" w:w="2727"/>
           </w:tcPr>
           <w:p>
             <w:pPr>
@@ -5433,7 +5433,7 @@
         </w:tc>
         <w:tc>
           <w:tcPr>
-            <w:tcW w:type="dxa" w:w="1587"/>
+            <w:tcW w:type="dxa" w:w="1818"/>
           </w:tcPr>
           <w:p>
             <w:pPr>
@@ -5455,7 +5455,7 @@
         </w:trPr>
         <w:tc>
           <w:tcPr>
-            <w:tcW w:type="dxa" w:w="567"/>
+            <w:tcW w:type="dxa" w:w="649"/>
             <w:shd w:val="clear" w:color="auto" w:fill="E8F5E9"/>
           </w:tcPr>
           <w:p>
@@ -5473,7 +5473,7 @@
         </w:tc>
         <w:tc>
           <w:tcPr>
-            <w:tcW w:type="dxa" w:w="2835"/>
+            <w:tcW w:type="dxa" w:w="3246"/>
           </w:tcPr>
           <w:p>
             <w:pPr>
@@ -5502,7 +5502,7 @@
         </w:tc>
         <w:tc>
           <w:tcPr>
-            <w:tcW w:type="dxa" w:w="3855"/>
+            <w:tcW w:type="dxa" w:w="4415"/>
           </w:tcPr>
           <w:p>
             <w:pPr>
@@ -5543,7 +5543,7 @@
         </w:tc>
         <w:tc>
           <w:tcPr>
-            <w:tcW w:type="dxa" w:w="850"/>
+            <w:tcW w:type="dxa" w:w="974"/>
           </w:tcPr>
           <w:p>
             <w:pPr>
@@ -5560,7 +5560,7 @@
         </w:tc>
         <w:tc>
           <w:tcPr>
-            <w:tcW w:type="dxa" w:w="3005"/>
+            <w:tcW w:type="dxa" w:w="3441"/>
           </w:tcPr>
           <w:p>
             <w:pPr>
@@ -5577,7 +5577,7 @@
         </w:tc>
         <w:tc>
           <w:tcPr>
-            <w:tcW w:type="dxa" w:w="2381"/>
+            <w:tcW w:type="dxa" w:w="2727"/>
           </w:tcPr>
           <w:p>
             <w:pPr>
@@ -5594,7 +5594,7 @@
         </w:tc>
         <w:tc>
           <w:tcPr>
-            <w:tcW w:type="dxa" w:w="1587"/>
+            <w:tcW w:type="dxa" w:w="1818"/>
           </w:tcPr>
           <w:p>
             <w:pPr>
@@ -5616,7 +5616,7 @@
         </w:trPr>
         <w:tc>
           <w:tcPr>
-            <w:tcW w:type="dxa" w:w="567"/>
+            <w:tcW w:type="dxa" w:w="649"/>
             <w:shd w:val="clear" w:color="auto" w:fill="E8F5E9"/>
           </w:tcPr>
           <w:p>
@@ -5634,7 +5634,7 @@
         </w:tc>
         <w:tc>
           <w:tcPr>
-            <w:tcW w:type="dxa" w:w="2835"/>
+            <w:tcW w:type="dxa" w:w="3246"/>
           </w:tcPr>
           <w:p>
             <w:pPr>
@@ -5651,7 +5651,7 @@
         </w:tc>
         <w:tc>
           <w:tcPr>
-            <w:tcW w:type="dxa" w:w="3855"/>
+            <w:tcW w:type="dxa" w:w="4415"/>
           </w:tcPr>
           <w:p>
             <w:pPr>
@@ -5692,7 +5692,7 @@
         </w:tc>
         <w:tc>
           <w:tcPr>
-            <w:tcW w:type="dxa" w:w="850"/>
+            <w:tcW w:type="dxa" w:w="974"/>
           </w:tcPr>
           <w:p>
             <w:pPr>
@@ -5709,7 +5709,7 @@
         </w:tc>
         <w:tc>
           <w:tcPr>
-            <w:tcW w:type="dxa" w:w="3005"/>
+            <w:tcW w:type="dxa" w:w="3441"/>
           </w:tcPr>
           <w:p>
             <w:pPr>
@@ -5726,7 +5726,7 @@
         </w:tc>
         <w:tc>
           <w:tcPr>
-            <w:tcW w:type="dxa" w:w="2381"/>
+            <w:tcW w:type="dxa" w:w="2727"/>
           </w:tcPr>
           <w:p>
             <w:pPr>
@@ -5743,7 +5743,7 @@
         </w:tc>
         <w:tc>
           <w:tcPr>
-            <w:tcW w:type="dxa" w:w="1587"/>
+            <w:tcW w:type="dxa" w:w="1818"/>
           </w:tcPr>
           <w:p>
             <w:pPr>
@@ -5765,7 +5765,7 @@
         </w:trPr>
         <w:tc>
           <w:tcPr>
-            <w:tcW w:type="dxa" w:w="567"/>
+            <w:tcW w:type="dxa" w:w="649"/>
             <w:shd w:val="clear" w:color="auto" w:fill="E8F5E9"/>
           </w:tcPr>
           <w:p>
@@ -5783,7 +5783,7 @@
         </w:tc>
         <w:tc>
           <w:tcPr>
-            <w:tcW w:type="dxa" w:w="2835"/>
+            <w:tcW w:type="dxa" w:w="3246"/>
           </w:tcPr>
           <w:p>
             <w:pPr>
@@ -5812,7 +5812,7 @@
         </w:tc>
         <w:tc>
           <w:tcPr>
-            <w:tcW w:type="dxa" w:w="3855"/>
+            <w:tcW w:type="dxa" w:w="4415"/>
           </w:tcPr>
           <w:p>
             <w:pPr>
@@ -5853,7 +5853,7 @@
         </w:tc>
         <w:tc>
           <w:tcPr>
-            <w:tcW w:type="dxa" w:w="850"/>
+            <w:tcW w:type="dxa" w:w="974"/>
           </w:tcPr>
           <w:p>
             <w:pPr>
@@ -5870,7 +5870,7 @@
         </w:tc>
         <w:tc>
           <w:tcPr>
-            <w:tcW w:type="dxa" w:w="3005"/>
+            <w:tcW w:type="dxa" w:w="3441"/>
           </w:tcPr>
           <w:p>
             <w:pPr>
@@ -5887,7 +5887,7 @@
         </w:tc>
         <w:tc>
           <w:tcPr>
-            <w:tcW w:type="dxa" w:w="2381"/>
+            <w:tcW w:type="dxa" w:w="2727"/>
           </w:tcPr>
           <w:p>
             <w:pPr>
@@ -5904,7 +5904,7 @@
         </w:tc>
         <w:tc>
           <w:tcPr>
-            <w:tcW w:type="dxa" w:w="1587"/>
+            <w:tcW w:type="dxa" w:w="1818"/>
           </w:tcPr>
           <w:p>
             <w:pPr>
@@ -5926,7 +5926,7 @@
         </w:trPr>
         <w:tc>
           <w:tcPr>
-            <w:tcW w:type="dxa" w:w="567"/>
+            <w:tcW w:type="dxa" w:w="649"/>
             <w:shd w:val="clear" w:color="auto" w:fill="E8F5E9"/>
           </w:tcPr>
           <w:p>
@@ -5944,7 +5944,7 @@
         </w:tc>
         <w:tc>
           <w:tcPr>
-            <w:tcW w:type="dxa" w:w="2835"/>
+            <w:tcW w:type="dxa" w:w="3246"/>
           </w:tcPr>
           <w:p>
             <w:pPr>
@@ -5961,7 +5961,7 @@
         </w:tc>
         <w:tc>
           <w:tcPr>
-            <w:tcW w:type="dxa" w:w="3855"/>
+            <w:tcW w:type="dxa" w:w="4415"/>
           </w:tcPr>
           <w:p>
             <w:pPr>
@@ -6002,7 +6002,7 @@
         </w:tc>
         <w:tc>
           <w:tcPr>
-            <w:tcW w:type="dxa" w:w="850"/>
+            <w:tcW w:type="dxa" w:w="974"/>
           </w:tcPr>
           <w:p>
             <w:pPr>
@@ -6019,7 +6019,7 @@
         </w:tc>
         <w:tc>
           <w:tcPr>
-            <w:tcW w:type="dxa" w:w="3005"/>
+            <w:tcW w:type="dxa" w:w="3441"/>
           </w:tcPr>
           <w:p>
             <w:pPr>
@@ -6036,7 +6036,7 @@
         </w:tc>
         <w:tc>
           <w:tcPr>
-            <w:tcW w:type="dxa" w:w="2381"/>
+            <w:tcW w:type="dxa" w:w="2727"/>
           </w:tcPr>
           <w:p>
             <w:pPr>
@@ -6053,7 +6053,7 @@
         </w:tc>
         <w:tc>
           <w:tcPr>
-            <w:tcW w:type="dxa" w:w="1587"/>
+            <w:tcW w:type="dxa" w:w="1818"/>
           </w:tcPr>
           <w:p>
             <w:pPr>
@@ -6075,7 +6075,7 @@
         </w:trPr>
         <w:tc>
           <w:tcPr>
-            <w:tcW w:type="dxa" w:w="567"/>
+            <w:tcW w:type="dxa" w:w="649"/>
             <w:shd w:val="clear" w:color="auto" w:fill="EAF0F6"/>
           </w:tcPr>
           <w:p>
@@ -6093,7 +6093,7 @@
         </w:tc>
         <w:tc>
           <w:tcPr>
-            <w:tcW w:type="dxa" w:w="2835"/>
+            <w:tcW w:type="dxa" w:w="3246"/>
             <w:shd w:val="clear" w:color="auto" w:fill="EAF0F6"/>
           </w:tcPr>
           <w:p>
@@ -6111,7 +6111,7 @@
         </w:tc>
         <w:tc>
           <w:tcPr>
-            <w:tcW w:type="dxa" w:w="3855"/>
+            <w:tcW w:type="dxa" w:w="4415"/>
             <w:shd w:val="clear" w:color="auto" w:fill="EAF0F6"/>
           </w:tcPr>
           <w:p>
@@ -6153,7 +6153,7 @@
         </w:tc>
         <w:tc>
           <w:tcPr>
-            <w:tcW w:type="dxa" w:w="850"/>
+            <w:tcW w:type="dxa" w:w="974"/>
             <w:shd w:val="clear" w:color="auto" w:fill="EAF0F6"/>
           </w:tcPr>
           <w:p>
@@ -6171,7 +6171,7 @@
         </w:tc>
         <w:tc>
           <w:tcPr>
-            <w:tcW w:type="dxa" w:w="3005"/>
+            <w:tcW w:type="dxa" w:w="3441"/>
             <w:shd w:val="clear" w:color="auto" w:fill="EAF0F6"/>
           </w:tcPr>
           <w:p>
@@ -6189,7 +6189,7 @@
         </w:tc>
         <w:tc>
           <w:tcPr>
-            <w:tcW w:type="dxa" w:w="2381"/>
+            <w:tcW w:type="dxa" w:w="2727"/>
             <w:shd w:val="clear" w:color="auto" w:fill="EAF0F6"/>
           </w:tcPr>
           <w:p>
@@ -6207,7 +6207,7 @@
         </w:tc>
         <w:tc>
           <w:tcPr>
-            <w:tcW w:type="dxa" w:w="1587"/>
+            <w:tcW w:type="dxa" w:w="1818"/>
             <w:shd w:val="clear" w:color="auto" w:fill="EAF0F6"/>
           </w:tcPr>
           <w:p>
@@ -6426,8 +6426,8 @@
     <w:sectPr>
       <w:footerReference w:type="default" r:id="rId40"/>
       <w:headerReference w:type="default" r:id="rId41"/>
-      <w:pgSz w:w="16838" w:h="11906" w:orient="landscape"/>
-      <w:pgMar w:top="680" w:right="850" w:bottom="680" w:left="850" w:header="720" w:footer="720" w:gutter="0"/>
+      <w:pgSz w:w="18709" w:h="12246" w:orient="landscape"/>
+      <w:pgMar w:top="720" w:right="720" w:bottom="720" w:left="720" w:header="340" w:footer="340" w:gutter="0"/>
       <w:cols w:space="720"/>
       <w:docGrid w:linePitch="360"/>
     </w:sectPr>

</xml_diff>